<commit_message>
Add revised artifact outputs and documentation
</commit_message>
<xml_diff>
--- a/LLM Prompts/Specific Instructions.docx
+++ b/LLM Prompts/Specific Instructions.docx
@@ -483,7 +483,25 @@
           <w:bCs w:val="0"/>
           <w:u w:val="none"/>
         </w:rPr>
-        <w:t xml:space="preserve"> software products.  This reuse process creates a complex software supply chain and introduces </w:t>
+        <w:t xml:space="preserve"> software products</w:t>
+      </w:r>
+      <w:r>
+        <w:rPr>
+          <w:rFonts w:ascii="Times New Roman" w:hAnsi="Times New Roman" w:eastAsia="Times New Roman" w:cs="Times New Roman"/>
+          <w:b w:val="0"/>
+          <w:bCs w:val="0"/>
+          <w:u w:val="none"/>
+        </w:rPr>
+        <w:t xml:space="preserve">.  </w:t>
+      </w:r>
+      <w:r>
+        <w:rPr>
+          <w:rFonts w:ascii="Times New Roman" w:hAnsi="Times New Roman" w:eastAsia="Times New Roman" w:cs="Times New Roman"/>
+          <w:b w:val="0"/>
+          <w:bCs w:val="0"/>
+          <w:u w:val="none"/>
+        </w:rPr>
+        <w:t xml:space="preserve">This reuse process creates a complex software supply chain and introduces </w:t>
       </w:r>
       <w:r>
         <w:rPr>
@@ -528,25 +546,7 @@
           <w:bCs w:val="0"/>
           <w:u w:val="none"/>
         </w:rPr>
-        <w:t xml:space="preserve"> mi</w:t>
-      </w:r>
-      <w:r>
-        <w:rPr>
-          <w:rFonts w:ascii="Times New Roman" w:hAnsi="Times New Roman" w:eastAsia="Times New Roman" w:cs="Times New Roman"/>
-          <w:b w:val="0"/>
-          <w:bCs w:val="0"/>
-          <w:u w:val="none"/>
-        </w:rPr>
-        <w:t xml:space="preserve">tigate this class </w:t>
-      </w:r>
-      <w:r>
-        <w:rPr>
-          <w:rFonts w:ascii="Times New Roman" w:hAnsi="Times New Roman" w:eastAsia="Times New Roman" w:cs="Times New Roman"/>
-          <w:b w:val="0"/>
-          <w:bCs w:val="0"/>
-          <w:u w:val="none"/>
-        </w:rPr>
-        <w:t xml:space="preserve">of risk, the integrity of artifacts and the authenticity of actors must be </w:t>
+        <w:t xml:space="preserve"> mitigate this class of risk, the integrity of artifacts and the authenticity of actors must be </w:t>
       </w:r>
       <w:r>
         <w:rPr>
@@ -564,25 +564,7 @@
           <w:bCs w:val="0"/>
           <w:u w:val="none"/>
         </w:rPr>
-        <w:t xml:space="preserve"> throughou</w:t>
-      </w:r>
-      <w:r>
-        <w:rPr>
-          <w:rFonts w:ascii="Times New Roman" w:hAnsi="Times New Roman" w:eastAsia="Times New Roman" w:cs="Times New Roman"/>
-          <w:b w:val="0"/>
-          <w:bCs w:val="0"/>
-          <w:u w:val="none"/>
-        </w:rPr>
-        <w:t>t the suppl</w:t>
-      </w:r>
-      <w:r>
-        <w:rPr>
-          <w:rFonts w:ascii="Times New Roman" w:hAnsi="Times New Roman" w:eastAsia="Times New Roman" w:cs="Times New Roman"/>
-          <w:b w:val="0"/>
-          <w:bCs w:val="0"/>
-          <w:u w:val="none"/>
-        </w:rPr>
-        <w:t xml:space="preserve">y chain; this is called </w:t>
+        <w:t xml:space="preserve"> throughout the supply chain; this is called </w:t>
       </w:r>
       <w:r>
         <w:rPr>
@@ -636,43 +618,7 @@
           <w:bCs w:val="0"/>
           <w:u w:val="none"/>
         </w:rPr>
-        <w:t>Software</w:t>
-      </w:r>
-      <w:r>
-        <w:rPr>
-          <w:rFonts w:ascii="Times New Roman" w:hAnsi="Times New Roman" w:eastAsia="Times New Roman" w:cs="Times New Roman"/>
-          <w:b w:val="0"/>
-          <w:bCs w:val="0"/>
-          <w:u w:val="none"/>
-        </w:rPr>
-        <w:t xml:space="preserve"> signing pr</w:t>
-      </w:r>
-      <w:r>
-        <w:rPr>
-          <w:rFonts w:ascii="Times New Roman" w:hAnsi="Times New Roman" w:eastAsia="Times New Roman" w:cs="Times New Roman"/>
-          <w:b w:val="0"/>
-          <w:bCs w:val="0"/>
-          <w:u w:val="none"/>
-        </w:rPr>
-        <w:t xml:space="preserve">ovides the </w:t>
-      </w:r>
-      <w:r>
-        <w:rPr>
-          <w:rFonts w:ascii="Times New Roman" w:hAnsi="Times New Roman" w:eastAsia="Times New Roman" w:cs="Times New Roman"/>
-          <w:b w:val="0"/>
-          <w:bCs w:val="0"/>
-          <w:u w:val="none"/>
-        </w:rPr>
-        <w:t>str</w:t>
-      </w:r>
-      <w:r>
-        <w:rPr>
-          <w:rFonts w:ascii="Times New Roman" w:hAnsi="Times New Roman" w:eastAsia="Times New Roman" w:cs="Times New Roman"/>
-          <w:b w:val="0"/>
-          <w:bCs w:val="0"/>
-          <w:u w:val="none"/>
-        </w:rPr>
-        <w:t>ongest formally proven guarantee of provenance in practice</w:t>
+        <w:t>Software signing provides the strongest formally proven guarantee of provenance in practice</w:t>
       </w:r>
       <w:r>
         <w:rPr>
@@ -699,25 +645,7 @@
           <w:bCs w:val="0"/>
           <w:u w:val="none"/>
         </w:rPr>
-        <w:t>Software signing cryptographically link</w:t>
-      </w:r>
-      <w:r>
-        <w:rPr>
-          <w:rFonts w:ascii="Times New Roman" w:hAnsi="Times New Roman" w:eastAsia="Times New Roman" w:cs="Times New Roman"/>
-          <w:b w:val="0"/>
-          <w:bCs w:val="0"/>
-          <w:u w:val="none"/>
-        </w:rPr>
-        <w:t>s a</w:t>
-      </w:r>
-      <w:r>
-        <w:rPr>
-          <w:rFonts w:ascii="Times New Roman" w:hAnsi="Times New Roman" w:eastAsia="Times New Roman" w:cs="Times New Roman"/>
-          <w:b w:val="0"/>
-          <w:bCs w:val="0"/>
-          <w:u w:val="none"/>
-        </w:rPr>
-        <w:t xml:space="preserve"> software artifact</w:t>
+        <w:t>Software signing cryptographically links a software artifact</w:t>
       </w:r>
       <w:r>
         <w:rPr>
@@ -834,25 +762,7 @@
           <w:bCs w:val="0"/>
           <w:u w:val="none"/>
         </w:rPr>
-        <w:t>spans two co</w:t>
-      </w:r>
-      <w:r>
-        <w:rPr>
-          <w:rFonts w:ascii="Times New Roman" w:hAnsi="Times New Roman" w:eastAsia="Times New Roman" w:cs="Times New Roman"/>
-          <w:b w:val="0"/>
-          <w:bCs w:val="0"/>
-          <w:u w:val="none"/>
-        </w:rPr>
-        <w:t>upled workf</w:t>
-      </w:r>
-      <w:r>
-        <w:rPr>
-          <w:rFonts w:ascii="Times New Roman" w:hAnsi="Times New Roman" w:eastAsia="Times New Roman" w:cs="Times New Roman"/>
-          <w:b w:val="0"/>
-          <w:bCs w:val="0"/>
-          <w:u w:val="none"/>
-        </w:rPr>
-        <w:t>lows: upstream signature creation</w:t>
+        <w:t>spans two coupled workflows: upstream signature creation</w:t>
       </w:r>
       <w:r>
         <w:rPr>
@@ -970,6 +880,15 @@
           <w:u w:val="none"/>
         </w:rPr>
         <w:t>verifying.</w:t>
+      </w:r>
+      <w:r>
+        <w:rPr>
+          <w:rFonts w:ascii="Times New Roman" w:hAnsi="Times New Roman" w:eastAsia="Times New Roman" w:cs="Times New Roman"/>
+          <w:b w:val="0"/>
+          <w:bCs w:val="0"/>
+          <w:u w:val="none"/>
+        </w:rPr>
+        <w:t xml:space="preserve"> </w:t>
       </w:r>
       <w:r>
         <w:rPr>

</xml_diff>